<commit_message>
next steps added to CLAUDE.md
</commit_message>
<xml_diff>
--- a/Changes to Excel sheet.docx
+++ b/Changes to Excel sheet.docx
@@ -1,6 +1,6 @@
 
 <file path=word/document.xml><?xml version="1.0" encoding="utf-8"?>
-<w:document xmlns:wpc="http://schemas.microsoft.com/office/word/2010/wordprocessingCanvas" xmlns:cx="http://schemas.microsoft.com/office/drawing/2014/chartex" xmlns:cx1="http://schemas.microsoft.com/office/drawing/2015/9/8/chartex" xmlns:cx2="http://schemas.microsoft.com/office/drawing/2015/10/21/chartex" xmlns:cx3="http://schemas.microsoft.com/office/drawing/2016/5/9/chartex" xmlns:cx4="http://schemas.microsoft.com/office/drawing/2016/5/10/chartex" xmlns:cx5="http://schemas.microsoft.com/office/drawing/2016/5/11/chartex" xmlns:cx6="http://schemas.microsoft.com/office/drawing/2016/5/12/chartex" xmlns:cx7="http://schemas.microsoft.com/office/drawing/2016/5/13/chartex" xmlns:cx8="http://schemas.microsoft.com/office/drawing/2016/5/14/chartex" xmlns:mc="http://schemas.openxmlformats.org/markup-compatibility/2006" xmlns:aink="http://schemas.microsoft.com/office/drawing/2016/ink" xmlns:am3d="http://schemas.microsoft.com/office/drawing/2017/model3d" xmlns:o="urn:schemas-microsoft-com:office:office" xmlns:oel="http://schemas.microsoft.com/office/2019/extlst" xmlns:r="http://schemas.openxmlformats.org/officeDocument/2006/relationships" xmlns:m="http://schemas.openxmlformats.org/officeDocument/2006/math" xmlns:v="urn:schemas-microsoft-com:vml" xmlns:wp14="http://schemas.microsoft.com/office/word/2010/wordprocessingDrawing" xmlns:wp="http://schemas.openxmlformats.org/drawingml/2006/wordprocessingDrawing" xmlns:w10="urn:schemas-microsoft-com:office:word" xmlns:w="http://schemas.openxmlformats.org/wordprocessingml/2006/main" xmlns:w14="http://schemas.microsoft.com/office/word/2010/wordml" xmlns:w15="http://schemas.microsoft.com/office/word/2012/wordml" xmlns:w16cex="http://schemas.microsoft.com/office/word/2018/wordml/cex" xmlns:w16cid="http://schemas.microsoft.com/office/word/2016/wordml/cid" xmlns:w16="http://schemas.microsoft.com/office/word/2018/wordml" xmlns:w16du="http://schemas.microsoft.com/office/word/2023/wordml/word16du" xmlns:w16sdtdh="http://schemas.microsoft.com/office/word/2020/wordml/sdtdatahash" xmlns:w16sdtfl="http://schemas.microsoft.com/office/word/2024/wordml/sdtformatlock" xmlns:w16se="http://schemas.microsoft.com/office/word/2015/wordml/symex" xmlns:wpg="http://schemas.microsoft.com/office/word/2010/wordprocessingGroup" xmlns:wpi="http://schemas.microsoft.com/office/word/2010/wordprocessingInk" xmlns:wne="http://schemas.microsoft.com/office/word/2006/wordml" xmlns:wps="http://schemas.microsoft.com/office/word/2010/wordprocessingShape" mc:Ignorable="w14 w15 w16se w16cid w16 w16cex w16sdtdh w16sdtfl w16du wp14">
+<w:document xmlns:wpc="http://schemas.microsoft.com/office/word/2010/wordprocessingCanvas" xmlns:cx="http://schemas.microsoft.com/office/drawing/2014/chartex" xmlns:cx1="http://schemas.microsoft.com/office/drawing/2015/9/8/chartex" xmlns:cx2="http://schemas.microsoft.com/office/drawing/2015/10/21/chartex" xmlns:cx3="http://schemas.microsoft.com/office/drawing/2016/5/9/chartex" xmlns:cx4="http://schemas.microsoft.com/office/drawing/2016/5/10/chartex" xmlns:cx5="http://schemas.microsoft.com/office/drawing/2016/5/11/chartex" xmlns:cx6="http://schemas.microsoft.com/office/drawing/2016/5/12/chartex" xmlns:cx7="http://schemas.microsoft.com/office/drawing/2016/5/13/chartex" xmlns:cx8="http://schemas.microsoft.com/office/drawing/2016/5/14/chartex" xmlns:mc="http://schemas.openxmlformats.org/markup-compatibility/2006" xmlns:aink="http://schemas.microsoft.com/office/drawing/2016/ink" xmlns:am3d="http://schemas.microsoft.com/office/drawing/2017/model3d" xmlns:o="urn:schemas-microsoft-com:office:office" xmlns:oel="http://schemas.microsoft.com/office/2019/extlst" xmlns:r="http://schemas.openxmlformats.org/officeDocument/2006/relationships" xmlns:m="http://schemas.openxmlformats.org/officeDocument/2006/math" xmlns:v="urn:schemas-microsoft-com:vml" xmlns:wp14="http://schemas.microsoft.com/office/word/2010/wordprocessingDrawing" xmlns:wp="http://schemas.openxmlformats.org/drawingml/2006/wordprocessingDrawing" xmlns:w10="urn:schemas-microsoft-com:office:word" xmlns:w="http://schemas.openxmlformats.org/wordprocessingml/2006/main" xmlns:w14="http://schemas.microsoft.com/office/word/2010/wordml" xmlns:w15="http://schemas.microsoft.com/office/word/2012/wordml" xmlns:w16cei="http://schemas.microsoft.com/office/word/2026/wordml/cei" xmlns:w16cex="http://schemas.microsoft.com/office/word/2018/wordml/cex" xmlns:w16cid="http://schemas.microsoft.com/office/word/2016/wordml/cid" xmlns:w16="http://schemas.microsoft.com/office/word/2018/wordml" xmlns:w16du="http://schemas.microsoft.com/office/word/2023/wordml/word16du" xmlns:w16sdtdh="http://schemas.microsoft.com/office/word/2020/wordml/sdtdatahash" xmlns:w16sdtfl="http://schemas.microsoft.com/office/word/2024/wordml/sdtformatlock" xmlns:w16se="http://schemas.microsoft.com/office/word/2015/wordml/symex" xmlns:wpg="http://schemas.microsoft.com/office/word/2010/wordprocessingGroup" xmlns:wpi="http://schemas.microsoft.com/office/word/2010/wordprocessingInk" xmlns:wne="http://schemas.microsoft.com/office/word/2006/wordml" xmlns:wps="http://schemas.microsoft.com/office/word/2010/wordprocessingShape" mc:Ignorable="w14 w15 w16se w16cid w16 w16cex w16sdtdh w16sdtfl w16du wp14">
   <w:body>
     <w:p>
       <w:pPr>
@@ -25,8 +25,14 @@
           <w:ilvl w:val="0"/>
           <w:numId w:val="1"/>
         </w:numPr>
-      </w:pPr>
-      <w:r>
+        <w:rPr>
+          <w:strike/>
+        </w:rPr>
+      </w:pPr>
+      <w:r>
+        <w:rPr>
+          <w:strike/>
+        </w:rPr>
         <w:t>Row 14. Change to Well identification number (instead of API number)</w:t>
       </w:r>
     </w:p>
@@ -37,8 +43,14 @@
           <w:ilvl w:val="0"/>
           <w:numId w:val="1"/>
         </w:numPr>
-      </w:pPr>
-      <w:r>
+        <w:rPr>
+          <w:strike/>
+        </w:rPr>
+      </w:pPr>
+      <w:r>
+        <w:rPr>
+          <w:strike/>
+        </w:rPr>
         <w:t>Row 15. Options to include Oil producer, gas producer, gas condensate producer (injectors are excluded).</w:t>
       </w:r>
     </w:p>
@@ -49,16 +61,28 @@
           <w:ilvl w:val="0"/>
           <w:numId w:val="1"/>
         </w:numPr>
-      </w:pPr>
-      <w:r>
+        <w:rPr>
+          <w:strike/>
+        </w:rPr>
+      </w:pPr>
+      <w:r>
+        <w:rPr>
+          <w:strike/>
+        </w:rPr>
         <w:t>Row 16. Prescribe depth for deep, ultradeep etc. (</w:t>
       </w:r>
       <w:proofErr w:type="spellStart"/>
       <w:r>
+        <w:rPr>
+          <w:strike/>
+        </w:rPr>
         <w:t>eg.</w:t>
       </w:r>
       <w:proofErr w:type="spellEnd"/>
       <w:r>
+        <w:rPr>
+          <w:strike/>
+        </w:rPr>
         <w:t xml:space="preserve"> Shelf can be defined as less than 3000 ft water depth etc.)</w:t>
       </w:r>
     </w:p>
@@ -69,16 +93,28 @@
           <w:ilvl w:val="0"/>
           <w:numId w:val="1"/>
         </w:numPr>
-      </w:pPr>
-      <w:r>
+        <w:rPr>
+          <w:strike/>
+        </w:rPr>
+      </w:pPr>
+      <w:r>
+        <w:rPr>
+          <w:strike/>
+        </w:rPr>
         <w:t xml:space="preserve">Row 20. Well TVD, add (RKB) to make it clear that it is with respect to </w:t>
       </w:r>
       <w:proofErr w:type="spellStart"/>
       <w:r>
+        <w:rPr>
+          <w:strike/>
+        </w:rPr>
         <w:t>kelly</w:t>
       </w:r>
       <w:proofErr w:type="spellEnd"/>
       <w:r>
+        <w:rPr>
+          <w:strike/>
+        </w:rPr>
         <w:t xml:space="preserve"> bushing.</w:t>
       </w:r>
     </w:p>
@@ -89,8 +125,14 @@
           <w:ilvl w:val="0"/>
           <w:numId w:val="1"/>
         </w:numPr>
-      </w:pPr>
-      <w:r>
+        <w:rPr>
+          <w:strike/>
+        </w:rPr>
+      </w:pPr>
+      <w:r>
+        <w:rPr>
+          <w:strike/>
+        </w:rPr>
         <w:t>Row 24. Add regions Latin America and Central America.</w:t>
       </w:r>
     </w:p>
@@ -873,34 +915,64 @@
           <w:ilvl w:val="0"/>
           <w:numId w:val="1"/>
         </w:numPr>
-      </w:pPr>
-      <w:r>
+        <w:rPr>
+          <w:strike/>
+        </w:rPr>
+      </w:pPr>
+      <w:r>
+        <w:rPr>
+          <w:strike/>
+        </w:rPr>
         <w:t>Add new row: Sand failure (</w:t>
       </w:r>
       <w:r>
+        <w:rPr>
+          <w:strike/>
+        </w:rPr>
         <w:t>Y</w:t>
       </w:r>
       <w:r>
+        <w:rPr>
+          <w:strike/>
+        </w:rPr>
         <w:t xml:space="preserve">es or </w:t>
       </w:r>
       <w:r>
+        <w:rPr>
+          <w:strike/>
+        </w:rPr>
         <w:t>N</w:t>
       </w:r>
       <w:r>
+        <w:rPr>
+          <w:strike/>
+        </w:rPr>
         <w:t xml:space="preserve">o). If </w:t>
       </w:r>
       <w:proofErr w:type="gramStart"/>
       <w:r>
+        <w:rPr>
+          <w:strike/>
+        </w:rPr>
         <w:t>Yes</w:t>
       </w:r>
       <w:proofErr w:type="gramEnd"/>
       <w:r>
+        <w:rPr>
+          <w:strike/>
+        </w:rPr>
         <w:t>, then show Row 28</w:t>
       </w:r>
       <w:r>
+        <w:rPr>
+          <w:strike/>
+        </w:rPr>
         <w:t xml:space="preserve"> and the rest of the failure questions</w:t>
       </w:r>
       <w:r>
+        <w:rPr>
+          <w:strike/>
+        </w:rPr>
         <w:t>.</w:t>
       </w:r>
     </w:p>
@@ -911,40 +983,70 @@
           <w:ilvl w:val="0"/>
           <w:numId w:val="1"/>
         </w:numPr>
-      </w:pPr>
-      <w:r>
+        <w:rPr>
+          <w:strike/>
+        </w:rPr>
+      </w:pPr>
+      <w:r>
+        <w:rPr>
+          <w:strike/>
+        </w:rPr>
         <w:t>Add new row: Severity of sand production: Options are, Minor (&lt;10lb/</w:t>
       </w:r>
       <w:proofErr w:type="spellStart"/>
       <w:r>
+        <w:rPr>
+          <w:strike/>
+        </w:rPr>
         <w:t>hr</w:t>
       </w:r>
       <w:proofErr w:type="spellEnd"/>
       <w:r>
+        <w:rPr>
+          <w:strike/>
+        </w:rPr>
         <w:t xml:space="preserve">), Major (10 to 100 </w:t>
       </w:r>
       <w:proofErr w:type="spellStart"/>
       <w:r>
+        <w:rPr>
+          <w:strike/>
+        </w:rPr>
         <w:t>lb</w:t>
       </w:r>
       <w:proofErr w:type="spellEnd"/>
       <w:r>
+        <w:rPr>
+          <w:strike/>
+        </w:rPr>
         <w:t>/</w:t>
       </w:r>
       <w:proofErr w:type="spellStart"/>
       <w:r>
+        <w:rPr>
+          <w:strike/>
+        </w:rPr>
         <w:t>hr</w:t>
       </w:r>
       <w:proofErr w:type="spellEnd"/>
       <w:r>
+        <w:rPr>
+          <w:strike/>
+        </w:rPr>
         <w:t>), Catastrophic (&gt;100lb/</w:t>
       </w:r>
       <w:proofErr w:type="spellStart"/>
       <w:r>
+        <w:rPr>
+          <w:strike/>
+        </w:rPr>
         <w:t>hr</w:t>
       </w:r>
       <w:proofErr w:type="spellEnd"/>
       <w:r>
+        <w:rPr>
+          <w:strike/>
+        </w:rPr>
         <w:t xml:space="preserve">). </w:t>
       </w:r>
     </w:p>
@@ -955,8 +1057,14 @@
           <w:ilvl w:val="0"/>
           <w:numId w:val="1"/>
         </w:numPr>
-      </w:pPr>
-      <w:r>
+        <w:rPr>
+          <w:strike/>
+        </w:rPr>
+      </w:pPr>
+      <w:r>
+        <w:rPr>
+          <w:strike/>
+        </w:rPr>
         <w:t>Row 28. Time to failure. Split into 3 rows: (1) Time to first choke back and (2) Time to well shut-in due to sand. (3) Time to complete well failure</w:t>
       </w:r>
     </w:p>
@@ -967,14 +1075,26 @@
           <w:ilvl w:val="0"/>
           <w:numId w:val="1"/>
         </w:numPr>
-      </w:pPr>
-      <w:r>
+        <w:rPr>
+          <w:strike/>
+        </w:rPr>
+      </w:pPr>
+      <w:r>
+        <w:rPr>
+          <w:strike/>
+        </w:rPr>
         <w:t xml:space="preserve">Row 29: Change to, Sand failure mechanism. Drop down options are: Aggressive drawdown, screen plugging, water breakthrough, water hammer, </w:t>
       </w:r>
       <w:r>
+        <w:rPr>
+          <w:strike/>
+        </w:rPr>
         <w:t xml:space="preserve">hard shutdown, </w:t>
       </w:r>
       <w:r>
+        <w:rPr>
+          <w:strike/>
+        </w:rPr>
         <w:t>other, unknown.</w:t>
       </w:r>
     </w:p>
@@ -985,8 +1105,14 @@
           <w:ilvl w:val="0"/>
           <w:numId w:val="1"/>
         </w:numPr>
-      </w:pPr>
-      <w:r>
+        <w:rPr>
+          <w:strike/>
+        </w:rPr>
+      </w:pPr>
+      <w:r>
+        <w:rPr>
+          <w:strike/>
+        </w:rPr>
         <w:t>Row 31. Split this into 3 rows: (1) Sand production rate at first choke back, (2) Sand production rate at well shut-in due to sand, (3) Sand production rate at complete well failure.</w:t>
       </w:r>
     </w:p>
@@ -997,8 +1123,14 @@
           <w:ilvl w:val="0"/>
           <w:numId w:val="1"/>
         </w:numPr>
-      </w:pPr>
-      <w:r>
+        <w:rPr>
+          <w:strike/>
+        </w:rPr>
+      </w:pPr>
+      <w:r>
+        <w:rPr>
+          <w:strike/>
+        </w:rPr>
         <w:t>Row 32. Add new row: Initial well PI.</w:t>
       </w:r>
     </w:p>
@@ -1009,8 +1141,14 @@
           <w:ilvl w:val="0"/>
           <w:numId w:val="1"/>
         </w:numPr>
-      </w:pPr>
-      <w:r>
+        <w:rPr>
+          <w:strike/>
+        </w:rPr>
+      </w:pPr>
+      <w:r>
+        <w:rPr>
+          <w:strike/>
+        </w:rPr>
         <w:t>Add new row. Initial total skin</w:t>
       </w:r>
     </w:p>
@@ -1021,8 +1159,14 @@
           <w:ilvl w:val="0"/>
           <w:numId w:val="1"/>
         </w:numPr>
-      </w:pPr>
-      <w:r>
+        <w:rPr>
+          <w:strike/>
+        </w:rPr>
+      </w:pPr>
+      <w:r>
+        <w:rPr>
+          <w:strike/>
+        </w:rPr>
         <w:t>Add new row. Initial non-Darcy skin</w:t>
       </w:r>
     </w:p>
@@ -1033,8 +1177,14 @@
           <w:ilvl w:val="0"/>
           <w:numId w:val="1"/>
         </w:numPr>
-      </w:pPr>
-      <w:r>
+        <w:rPr>
+          <w:strike/>
+        </w:rPr>
+      </w:pPr>
+      <w:r>
+        <w:rPr>
+          <w:strike/>
+        </w:rPr>
         <w:t>Add new row: Initial deviated well skin</w:t>
       </w:r>
     </w:p>
@@ -1045,20 +1195,38 @@
           <w:ilvl w:val="0"/>
           <w:numId w:val="1"/>
         </w:numPr>
-      </w:pPr>
-      <w:r>
+        <w:rPr>
+          <w:strike/>
+        </w:rPr>
+      </w:pPr>
+      <w:r>
+        <w:rPr>
+          <w:strike/>
+        </w:rPr>
         <w:t xml:space="preserve">Row 32. Change to </w:t>
       </w:r>
       <w:r>
+        <w:rPr>
+          <w:strike/>
+        </w:rPr>
         <w:t>“</w:t>
       </w:r>
       <w:r>
+        <w:rPr>
+          <w:strike/>
+        </w:rPr>
         <w:t>Well PI after choke-back</w:t>
       </w:r>
       <w:r>
+        <w:rPr>
+          <w:strike/>
+        </w:rPr>
         <w:t>”</w:t>
       </w:r>
       <w:r>
+        <w:rPr>
+          <w:strike/>
+        </w:rPr>
         <w:t xml:space="preserve"> </w:t>
       </w:r>
     </w:p>
@@ -1069,8 +1237,14 @@
           <w:ilvl w:val="0"/>
           <w:numId w:val="1"/>
         </w:numPr>
-      </w:pPr>
-      <w:r>
+        <w:rPr>
+          <w:strike/>
+        </w:rPr>
+      </w:pPr>
+      <w:r>
+        <w:rPr>
+          <w:strike/>
+        </w:rPr>
         <w:t>Add new row. Total skin after choke-back</w:t>
       </w:r>
     </w:p>
@@ -1081,15 +1255,15 @@
           <w:ilvl w:val="0"/>
           <w:numId w:val="1"/>
         </w:numPr>
-      </w:pPr>
-      <w:r>
-        <w:t>Add new row. Non-Darcy skin</w:t>
-      </w:r>
-      <w:r>
-        <w:t xml:space="preserve"> </w:t>
-      </w:r>
-      <w:r>
-        <w:t>after choke-back</w:t>
+        <w:rPr>
+          <w:strike/>
+        </w:rPr>
+      </w:pPr>
+      <w:r>
+        <w:rPr>
+          <w:strike/>
+        </w:rPr>
+        <w:t>Add new row. Non-Darcy skin after choke-back</w:t>
       </w:r>
     </w:p>
     <w:p>
@@ -1099,15 +1273,15 @@
           <w:ilvl w:val="0"/>
           <w:numId w:val="1"/>
         </w:numPr>
-      </w:pPr>
-      <w:r>
-        <w:t>Add new row: Deviated well skin</w:t>
-      </w:r>
-      <w:r>
-        <w:t xml:space="preserve"> </w:t>
-      </w:r>
-      <w:r>
-        <w:t>after choke-back</w:t>
+        <w:rPr>
+          <w:strike/>
+        </w:rPr>
+      </w:pPr>
+      <w:r>
+        <w:rPr>
+          <w:strike/>
+        </w:rPr>
+        <w:t>Add new row: Deviated well skin after choke-back</w:t>
       </w:r>
     </w:p>
     <w:tbl>
@@ -1891,8 +2065,14 @@
           <w:ilvl w:val="0"/>
           <w:numId w:val="1"/>
         </w:numPr>
-      </w:pPr>
-      <w:r>
+        <w:rPr>
+          <w:strike/>
+        </w:rPr>
+      </w:pPr>
+      <w:r>
+        <w:rPr>
+          <w:strike/>
+        </w:rPr>
         <w:t>Row 36. Add option., Shut in due to reasons other than sand.</w:t>
       </w:r>
     </w:p>
@@ -1903,9 +2083,29 @@
           <w:ilvl w:val="0"/>
           <w:numId w:val="1"/>
         </w:numPr>
-      </w:pPr>
-      <w:r>
-        <w:t>Row 37. Add new row for well startup date.</w:t>
+        <w:rPr>
+          <w:strike/>
+        </w:rPr>
+      </w:pPr>
+      <w:r>
+        <w:rPr>
+          <w:strike/>
+        </w:rPr>
+        <w:t xml:space="preserve">Row 37. Add new </w:t>
+      </w:r>
+      <w:proofErr w:type="gramStart"/>
+      <w:r>
+        <w:rPr>
+          <w:strike/>
+        </w:rPr>
+        <w:t>row</w:t>
+      </w:r>
+      <w:proofErr w:type="gramEnd"/>
+      <w:r>
+        <w:rPr>
+          <w:strike/>
+        </w:rPr>
+        <w:t xml:space="preserve"> for well startup date.</w:t>
       </w:r>
     </w:p>
     <w:p>
@@ -1915,16 +2115,28 @@
           <w:ilvl w:val="0"/>
           <w:numId w:val="1"/>
         </w:numPr>
-      </w:pPr>
-      <w:r>
+        <w:rPr>
+          <w:strike/>
+        </w:rPr>
+      </w:pPr>
+      <w:r>
+        <w:rPr>
+          <w:strike/>
+        </w:rPr>
         <w:t xml:space="preserve">Delete </w:t>
       </w:r>
       <w:proofErr w:type="spellStart"/>
       <w:r>
+        <w:rPr>
+          <w:strike/>
+        </w:rPr>
         <w:t>rows</w:t>
       </w:r>
       <w:proofErr w:type="spellEnd"/>
       <w:r>
+        <w:rPr>
+          <w:strike/>
+        </w:rPr>
         <w:t xml:space="preserve"> 38 to 40. Add new rows for oil, water and gas rates at first choke-back and at well shut-in due to sand (6 new rows). </w:t>
       </w:r>
     </w:p>
@@ -1935,11 +2147,20 @@
           <w:ilvl w:val="0"/>
           <w:numId w:val="1"/>
         </w:numPr>
-      </w:pPr>
-      <w:r>
+        <w:rPr>
+          <w:strike/>
+        </w:rPr>
+      </w:pPr>
+      <w:r>
+        <w:rPr>
+          <w:strike/>
+        </w:rPr>
         <w:t xml:space="preserve">Rows 45 and 46 provide option for </w:t>
       </w:r>
       <w:r>
+        <w:rPr>
+          <w:strike/>
+        </w:rPr>
         <w:t>“Unable to quantify” and “No sand”</w:t>
       </w:r>
     </w:p>
@@ -1950,8 +2171,14 @@
           <w:ilvl w:val="0"/>
           <w:numId w:val="1"/>
         </w:numPr>
-      </w:pPr>
-      <w:r>
+        <w:rPr>
+          <w:strike/>
+        </w:rPr>
+      </w:pPr>
+      <w:r>
+        <w:rPr>
+          <w:strike/>
+        </w:rPr>
         <w:t>Row 48. Add new row, Initial reservoir pore pressure</w:t>
       </w:r>
     </w:p>
@@ -1962,8 +2189,14 @@
           <w:ilvl w:val="0"/>
           <w:numId w:val="1"/>
         </w:numPr>
-      </w:pPr>
-      <w:r>
+        <w:rPr>
+          <w:strike/>
+        </w:rPr>
+      </w:pPr>
+      <w:r>
+        <w:rPr>
+          <w:strike/>
+        </w:rPr>
         <w:t xml:space="preserve">Delete Row 50. </w:t>
       </w:r>
     </w:p>
@@ -1974,18 +2207,33 @@
           <w:ilvl w:val="0"/>
           <w:numId w:val="1"/>
         </w:numPr>
-      </w:pPr>
-      <w:r>
+        <w:rPr>
+          <w:strike/>
+        </w:rPr>
+      </w:pPr>
+      <w:r>
+        <w:rPr>
+          <w:strike/>
+        </w:rPr>
         <w:lastRenderedPageBreak/>
         <w:t xml:space="preserve">Row 51. </w:t>
       </w:r>
       <w:r>
+        <w:rPr>
+          <w:strike/>
+        </w:rPr>
         <w:t xml:space="preserve">Define </w:t>
       </w:r>
       <w:r>
+        <w:rPr>
+          <w:strike/>
+        </w:rPr>
         <w:t>each option quantitatively (Choke changes over time</w:t>
       </w:r>
       <w:r>
+        <w:rPr>
+          <w:strike/>
+        </w:rPr>
         <w:t>. Gradual (increase choke size 0.01 inch per hour) etc.</w:t>
       </w:r>
     </w:p>
@@ -1996,44 +2244,86 @@
           <w:ilvl w:val="0"/>
           <w:numId w:val="1"/>
         </w:numPr>
-      </w:pPr>
-      <w:r>
+        <w:rPr>
+          <w:strike/>
+        </w:rPr>
+      </w:pPr>
+      <w:r>
+        <w:rPr>
+          <w:strike/>
+        </w:rPr>
         <w:t xml:space="preserve">Row 52. </w:t>
       </w:r>
       <w:r>
+        <w:rPr>
+          <w:strike/>
+        </w:rPr>
         <w:t xml:space="preserve">Change to </w:t>
       </w:r>
       <w:r>
+        <w:rPr>
+          <w:strike/>
+        </w:rPr>
         <w:t>“</w:t>
       </w:r>
       <w:r>
+        <w:rPr>
+          <w:strike/>
+        </w:rPr>
         <w:t xml:space="preserve">Post </w:t>
       </w:r>
       <w:r>
+        <w:rPr>
+          <w:strike/>
+        </w:rPr>
         <w:t>Sh</w:t>
       </w:r>
       <w:r>
+        <w:rPr>
+          <w:strike/>
+        </w:rPr>
         <w:t xml:space="preserve">ut-in </w:t>
       </w:r>
       <w:r>
+        <w:rPr>
+          <w:strike/>
+        </w:rPr>
         <w:t>Oil/Gas</w:t>
       </w:r>
       <w:r>
+        <w:rPr>
+          <w:strike/>
+        </w:rPr>
         <w:t xml:space="preserve"> </w:t>
       </w:r>
       <w:r>
+        <w:rPr>
+          <w:strike/>
+        </w:rPr>
         <w:t>Production R</w:t>
       </w:r>
       <w:r>
+        <w:rPr>
+          <w:strike/>
+        </w:rPr>
         <w:t xml:space="preserve">ate </w:t>
       </w:r>
       <w:r>
+        <w:rPr>
+          <w:strike/>
+        </w:rPr>
         <w:t>Res</w:t>
       </w:r>
       <w:r>
+        <w:rPr>
+          <w:strike/>
+        </w:rPr>
         <w:t>ponse</w:t>
       </w:r>
       <w:r>
+        <w:rPr>
+          <w:strike/>
+        </w:rPr>
         <w:t>”</w:t>
       </w:r>
     </w:p>
@@ -2842,29 +3132,56 @@
           <w:ilvl w:val="0"/>
           <w:numId w:val="1"/>
         </w:numPr>
-      </w:pPr>
-      <w:r>
+        <w:rPr>
+          <w:strike/>
+        </w:rPr>
+      </w:pPr>
+      <w:r>
+        <w:rPr>
+          <w:strike/>
+        </w:rPr>
         <w:t xml:space="preserve">Change the title to </w:t>
       </w:r>
       <w:r>
+        <w:rPr>
+          <w:strike/>
+        </w:rPr>
         <w:t>“</w:t>
       </w:r>
       <w:r>
+        <w:rPr>
+          <w:strike/>
+        </w:rPr>
         <w:t>Production intervals</w:t>
       </w:r>
       <w:r>
+        <w:rPr>
+          <w:strike/>
+        </w:rPr>
         <w:t>”</w:t>
       </w:r>
       <w:r>
+        <w:rPr>
+          <w:strike/>
+        </w:rPr>
         <w:t xml:space="preserve"> not </w:t>
       </w:r>
       <w:r>
+        <w:rPr>
+          <w:strike/>
+        </w:rPr>
         <w:t>“S</w:t>
       </w:r>
       <w:r>
+        <w:rPr>
+          <w:strike/>
+        </w:rPr>
         <w:t>and inter</w:t>
       </w:r>
       <w:r>
+        <w:rPr>
+          <w:strike/>
+        </w:rPr>
         <w:t xml:space="preserve">vals”. Each production interval can have several sand bodies. </w:t>
       </w:r>
     </w:p>
@@ -3055,61 +3372,118 @@
           <w:ilvl w:val="0"/>
           <w:numId w:val="1"/>
         </w:numPr>
-      </w:pPr>
-      <w:r>
+        <w:rPr>
+          <w:strike/>
+        </w:rPr>
+      </w:pPr>
+      <w:r>
+        <w:rPr>
+          <w:strike/>
+        </w:rPr>
         <w:t xml:space="preserve">Break up Pre-Production Phase into </w:t>
       </w:r>
       <w:r>
+        <w:rPr>
+          <w:strike/>
+        </w:rPr>
         <w:t>4</w:t>
       </w:r>
       <w:r>
+        <w:rPr>
+          <w:strike/>
+        </w:rPr>
         <w:t xml:space="preserve"> sub-sections: </w:t>
       </w:r>
       <w:r>
+        <w:rPr>
+          <w:strike/>
+        </w:rPr>
         <w:t>(1) Wellbore</w:t>
       </w:r>
       <w:r>
+        <w:rPr>
+          <w:strike/>
+        </w:rPr>
         <w:t xml:space="preserve"> properties</w:t>
       </w:r>
       <w:r>
+        <w:rPr>
+          <w:strike/>
+        </w:rPr>
         <w:t xml:space="preserve">, </w:t>
       </w:r>
       <w:r>
+        <w:rPr>
+          <w:strike/>
+        </w:rPr>
         <w:t>(</w:t>
       </w:r>
       <w:r>
+        <w:rPr>
+          <w:strike/>
+        </w:rPr>
         <w:t>2</w:t>
       </w:r>
       <w:r>
+        <w:rPr>
+          <w:strike/>
+        </w:rPr>
         <w:t xml:space="preserve">) </w:t>
       </w:r>
       <w:r>
+        <w:rPr>
+          <w:strike/>
+        </w:rPr>
         <w:t>Drilling, (</w:t>
       </w:r>
       <w:r>
+        <w:rPr>
+          <w:strike/>
+        </w:rPr>
         <w:t>3</w:t>
       </w:r>
       <w:r>
+        <w:rPr>
+          <w:strike/>
+        </w:rPr>
         <w:t>) C</w:t>
       </w:r>
       <w:r>
+        <w:rPr>
+          <w:strike/>
+        </w:rPr>
         <w:t>om</w:t>
       </w:r>
       <w:r>
+        <w:rPr>
+          <w:strike/>
+        </w:rPr>
         <w:t>pletion, (</w:t>
       </w:r>
       <w:r>
+        <w:rPr>
+          <w:strike/>
+        </w:rPr>
         <w:t>4</w:t>
       </w:r>
       <w:r>
+        <w:rPr>
+          <w:strike/>
+        </w:rPr>
         <w:t xml:space="preserve">) </w:t>
       </w:r>
       <w:proofErr w:type="gramStart"/>
       <w:r>
+        <w:rPr>
+          <w:strike/>
+        </w:rPr>
         <w:t>Pre-production</w:t>
       </w:r>
       <w:proofErr w:type="gramEnd"/>
       <w:r>
+        <w:rPr>
+          <w:strike/>
+        </w:rPr>
         <w:t xml:space="preserve"> cleanup</w:t>
       </w:r>
     </w:p>
@@ -3132,11 +3506,34 @@
           <w:ilvl w:val="0"/>
           <w:numId w:val="1"/>
         </w:numPr>
-      </w:pPr>
-      <w:r>
-        <w:t>Add row for Wellbore</w:t>
-      </w:r>
-      <w:r>
+        <w:rPr>
+          <w:strike/>
+        </w:rPr>
+      </w:pPr>
+      <w:r>
+        <w:rPr>
+          <w:strike/>
+        </w:rPr>
+        <w:t xml:space="preserve">Add </w:t>
+      </w:r>
+      <w:proofErr w:type="gramStart"/>
+      <w:r>
+        <w:rPr>
+          <w:strike/>
+        </w:rPr>
+        <w:t>row</w:t>
+      </w:r>
+      <w:proofErr w:type="gramEnd"/>
+      <w:r>
+        <w:rPr>
+          <w:strike/>
+        </w:rPr>
+        <w:t xml:space="preserve"> for Wellbore</w:t>
+      </w:r>
+      <w:r>
+        <w:rPr>
+          <w:strike/>
+        </w:rPr>
         <w:t xml:space="preserve"> properties: Casing diameter, interval length etc.</w:t>
       </w:r>
     </w:p>
@@ -3147,20 +3544,38 @@
           <w:ilvl w:val="0"/>
           <w:numId w:val="1"/>
         </w:numPr>
-      </w:pPr>
-      <w:r>
+        <w:rPr>
+          <w:strike/>
+        </w:rPr>
+      </w:pPr>
+      <w:r>
+        <w:rPr>
+          <w:strike/>
+        </w:rPr>
         <w:t xml:space="preserve">Add rows for Drilling </w:t>
       </w:r>
       <w:r>
+        <w:rPr>
+          <w:strike/>
+        </w:rPr>
         <w:t xml:space="preserve">sub-section </w:t>
       </w:r>
       <w:r>
+        <w:rPr>
+          <w:strike/>
+        </w:rPr>
         <w:t>(</w:t>
       </w:r>
       <w:r>
+        <w:rPr>
+          <w:strike/>
+        </w:rPr>
         <w:t xml:space="preserve">put Rows 62 to 67 here, </w:t>
       </w:r>
       <w:r>
+        <w:rPr>
+          <w:strike/>
+        </w:rPr>
         <w:t>drilling fluid, etc.)</w:t>
       </w:r>
     </w:p>
@@ -3296,8 +3711,14 @@
           <w:ilvl w:val="0"/>
           <w:numId w:val="1"/>
         </w:numPr>
-      </w:pPr>
-      <w:r>
+        <w:rPr>
+          <w:strike/>
+        </w:rPr>
+      </w:pPr>
+      <w:r>
+        <w:rPr>
+          <w:strike/>
+        </w:rPr>
         <w:t>Row 57. Change to “Production interval”</w:t>
       </w:r>
     </w:p>
@@ -3308,8 +3729,14 @@
           <w:ilvl w:val="0"/>
           <w:numId w:val="1"/>
         </w:numPr>
-      </w:pPr>
-      <w:r>
+        <w:rPr>
+          <w:strike/>
+        </w:rPr>
+      </w:pPr>
+      <w:r>
+        <w:rPr>
+          <w:strike/>
+        </w:rPr>
         <w:t>Row 60. Change to “Production interval”</w:t>
       </w:r>
     </w:p>
@@ -3320,8 +3747,14 @@
           <w:ilvl w:val="0"/>
           <w:numId w:val="1"/>
         </w:numPr>
-      </w:pPr>
-      <w:r>
+        <w:rPr>
+          <w:strike/>
+        </w:rPr>
+      </w:pPr>
+      <w:r>
+        <w:rPr>
+          <w:strike/>
+        </w:rPr>
         <w:t>Row 64. Add more weighting agents as options.</w:t>
       </w:r>
     </w:p>
@@ -3332,8 +3765,14 @@
           <w:ilvl w:val="0"/>
           <w:numId w:val="1"/>
         </w:numPr>
-      </w:pPr>
-      <w:r>
+        <w:rPr>
+          <w:strike/>
+        </w:rPr>
+      </w:pPr>
+      <w:r>
+        <w:rPr>
+          <w:strike/>
+        </w:rPr>
         <w:t xml:space="preserve"> Row 67. Add units</w:t>
       </w:r>
     </w:p>
@@ -3344,8 +3783,14 @@
           <w:ilvl w:val="0"/>
           <w:numId w:val="1"/>
         </w:numPr>
-      </w:pPr>
-      <w:r>
+        <w:rPr>
+          <w:strike/>
+        </w:rPr>
+      </w:pPr>
+      <w:r>
+        <w:rPr>
+          <w:strike/>
+        </w:rPr>
         <w:t>Delete Row 69</w:t>
       </w:r>
     </w:p>
@@ -3356,17 +3801,32 @@
           <w:ilvl w:val="0"/>
           <w:numId w:val="1"/>
         </w:numPr>
-      </w:pPr>
-      <w:r>
+        <w:rPr>
+          <w:strike/>
+        </w:rPr>
+      </w:pPr>
+      <w:r>
+        <w:rPr>
+          <w:strike/>
+        </w:rPr>
         <w:t xml:space="preserve">Delete </w:t>
       </w:r>
       <w:r>
+        <w:rPr>
+          <w:strike/>
+        </w:rPr>
         <w:t>Rows 70 to 7</w:t>
       </w:r>
       <w:r>
+        <w:rPr>
+          <w:strike/>
+        </w:rPr>
         <w:t>4</w:t>
       </w:r>
       <w:r>
+        <w:rPr>
+          <w:strike/>
+        </w:rPr>
         <w:t xml:space="preserve"> </w:t>
       </w:r>
     </w:p>
@@ -3377,8 +3837,14 @@
           <w:ilvl w:val="0"/>
           <w:numId w:val="1"/>
         </w:numPr>
-      </w:pPr>
-      <w:r>
+        <w:rPr>
+          <w:strike/>
+        </w:rPr>
+      </w:pPr>
+      <w:r>
+        <w:rPr>
+          <w:strike/>
+        </w:rPr>
         <w:t>Delete Row 78</w:t>
       </w:r>
     </w:p>
@@ -3389,8 +3855,14 @@
           <w:ilvl w:val="0"/>
           <w:numId w:val="1"/>
         </w:numPr>
-      </w:pPr>
-      <w:r>
+        <w:rPr>
+          <w:strike/>
+        </w:rPr>
+      </w:pPr>
+      <w:r>
+        <w:rPr>
+          <w:strike/>
+        </w:rPr>
         <w:t>Delete Row 80</w:t>
       </w:r>
     </w:p>
@@ -3401,25 +3873,46 @@
           <w:ilvl w:val="0"/>
           <w:numId w:val="1"/>
         </w:numPr>
-      </w:pPr>
-      <w:r>
+        <w:rPr>
+          <w:strike/>
+        </w:rPr>
+      </w:pPr>
+      <w:r>
+        <w:rPr>
+          <w:strike/>
+        </w:rPr>
         <w:t xml:space="preserve">Move Row 81 </w:t>
       </w:r>
       <w:r>
+        <w:rPr>
+          <w:strike/>
+        </w:rPr>
         <w:t xml:space="preserve">to 84 </w:t>
       </w:r>
       <w:r>
+        <w:rPr>
+          <w:strike/>
+        </w:rPr>
         <w:t xml:space="preserve">to </w:t>
       </w:r>
       <w:proofErr w:type="gramStart"/>
       <w:r>
+        <w:rPr>
+          <w:strike/>
+        </w:rPr>
         <w:t>Pre-production</w:t>
       </w:r>
       <w:proofErr w:type="gramEnd"/>
       <w:r>
+        <w:rPr>
+          <w:strike/>
+        </w:rPr>
         <w:t xml:space="preserve"> </w:t>
       </w:r>
       <w:r>
+        <w:rPr>
+          <w:strike/>
+        </w:rPr>
         <w:t>sub-section</w:t>
       </w:r>
     </w:p>
@@ -4281,11 +4774,20 @@
           <w:ilvl w:val="0"/>
           <w:numId w:val="1"/>
         </w:numPr>
-      </w:pPr>
-      <w:r>
+        <w:rPr>
+          <w:strike/>
+        </w:rPr>
+      </w:pPr>
+      <w:r>
+        <w:rPr>
+          <w:strike/>
+        </w:rPr>
         <w:t>Need all these properties for each completion interval</w:t>
       </w:r>
       <w:r>
+        <w:rPr>
+          <w:strike/>
+        </w:rPr>
         <w:t>.</w:t>
       </w:r>
     </w:p>
@@ -4296,11 +4798,20 @@
           <w:ilvl w:val="0"/>
           <w:numId w:val="1"/>
         </w:numPr>
-      </w:pPr>
-      <w:r>
+        <w:rPr>
+          <w:strike/>
+        </w:rPr>
+      </w:pPr>
+      <w:r>
+        <w:rPr>
+          <w:strike/>
+        </w:rPr>
         <w:t xml:space="preserve">Row 93 and 94. Change to </w:t>
       </w:r>
       <w:r>
+        <w:rPr>
+          <w:strike/>
+        </w:rPr>
         <w:t>Core derived Min rock UCS and Core derived P50 UCE</w:t>
       </w:r>
     </w:p>
@@ -4311,20 +4822,38 @@
           <w:ilvl w:val="0"/>
           <w:numId w:val="1"/>
         </w:numPr>
-      </w:pPr>
-      <w:r>
+        <w:rPr>
+          <w:strike/>
+        </w:rPr>
+      </w:pPr>
+      <w:r>
+        <w:rPr>
+          <w:strike/>
+        </w:rPr>
         <w:t xml:space="preserve">Row 96. </w:t>
       </w:r>
       <w:r>
+        <w:rPr>
+          <w:strike/>
+        </w:rPr>
         <w:t>“</w:t>
       </w:r>
       <w:r>
+        <w:rPr>
+          <w:strike/>
+        </w:rPr>
         <w:t>Rock compressibility</w:t>
       </w:r>
       <w:r>
+        <w:rPr>
+          <w:strike/>
+        </w:rPr>
         <w:t xml:space="preserve"> at initial reservoir pressure</w:t>
       </w:r>
       <w:r>
+        <w:rPr>
+          <w:strike/>
+        </w:rPr>
         <w:t>”</w:t>
       </w:r>
     </w:p>
@@ -4335,18 +4864,33 @@
           <w:ilvl w:val="0"/>
           <w:numId w:val="1"/>
         </w:numPr>
-      </w:pPr>
-      <w:r>
+        <w:rPr>
+          <w:strike/>
+        </w:rPr>
+      </w:pPr>
+      <w:r>
+        <w:rPr>
+          <w:strike/>
+        </w:rPr>
         <w:lastRenderedPageBreak/>
         <w:t xml:space="preserve">Add Row for </w:t>
       </w:r>
       <w:r>
+        <w:rPr>
+          <w:strike/>
+        </w:rPr>
         <w:t>“</w:t>
       </w:r>
       <w:r>
+        <w:rPr>
+          <w:strike/>
+        </w:rPr>
         <w:t xml:space="preserve">Reservoir pressure at </w:t>
       </w:r>
       <w:r>
+        <w:rPr>
+          <w:strike/>
+        </w:rPr>
         <w:t>first sand production”</w:t>
       </w:r>
     </w:p>
@@ -4357,17 +4901,26 @@
           <w:ilvl w:val="0"/>
           <w:numId w:val="1"/>
         </w:numPr>
-      </w:pPr>
-      <w:r>
-        <w:t xml:space="preserve">Add Row for </w:t>
-      </w:r>
-      <w:r>
-        <w:t xml:space="preserve">Rock compressibility at </w:t>
-      </w:r>
-      <w:r>
+        <w:rPr>
+          <w:strike/>
+        </w:rPr>
+      </w:pPr>
+      <w:r>
+        <w:rPr>
+          <w:strike/>
+        </w:rPr>
+        <w:t xml:space="preserve">Add Row for Rock compressibility at </w:t>
+      </w:r>
+      <w:r>
+        <w:rPr>
+          <w:strike/>
+        </w:rPr>
         <w:t>first sand production</w:t>
       </w:r>
       <w:r>
+        <w:rPr>
+          <w:strike/>
+        </w:rPr>
         <w:t xml:space="preserve"> </w:t>
       </w:r>
     </w:p>
@@ -4378,20 +4931,38 @@
           <w:ilvl w:val="0"/>
           <w:numId w:val="1"/>
         </w:numPr>
-      </w:pPr>
-      <w:r>
+        <w:rPr>
+          <w:strike/>
+        </w:rPr>
+      </w:pPr>
+      <w:r>
+        <w:rPr>
+          <w:strike/>
+        </w:rPr>
         <w:t>Add row for “Source of sand sample” with options</w:t>
       </w:r>
       <w:r>
+        <w:rPr>
+          <w:strike/>
+        </w:rPr>
         <w:t>: Cores, bottom-hole sa</w:t>
       </w:r>
       <w:r>
+        <w:rPr>
+          <w:strike/>
+        </w:rPr>
         <w:t xml:space="preserve">nd sample, </w:t>
       </w:r>
       <w:r>
+        <w:rPr>
+          <w:strike/>
+        </w:rPr>
         <w:t>surface sample, analog well</w:t>
       </w:r>
       <w:r>
+        <w:rPr>
+          <w:strike/>
+        </w:rPr>
         <w:t>.</w:t>
       </w:r>
     </w:p>
@@ -4402,14 +4973,26 @@
           <w:ilvl w:val="0"/>
           <w:numId w:val="1"/>
         </w:numPr>
-      </w:pPr>
-      <w:r>
+        <w:rPr>
+          <w:strike/>
+        </w:rPr>
+      </w:pPr>
+      <w:r>
+        <w:rPr>
+          <w:strike/>
+        </w:rPr>
         <w:t xml:space="preserve">Row 98. </w:t>
       </w:r>
       <w:r>
+        <w:rPr>
+          <w:strike/>
+        </w:rPr>
         <w:t xml:space="preserve">Add </w:t>
       </w:r>
       <w:r>
+        <w:rPr>
+          <w:strike/>
+        </w:rPr>
         <w:t>D40</w:t>
       </w:r>
     </w:p>
@@ -4420,8 +5003,14 @@
           <w:ilvl w:val="0"/>
           <w:numId w:val="1"/>
         </w:numPr>
-      </w:pPr>
-      <w:r>
+        <w:rPr>
+          <w:strike/>
+        </w:rPr>
+      </w:pPr>
+      <w:r>
+        <w:rPr>
+          <w:strike/>
+        </w:rPr>
         <w:t>Delete Row 99</w:t>
       </w:r>
     </w:p>
@@ -4432,19 +5021,34 @@
           <w:ilvl w:val="0"/>
           <w:numId w:val="1"/>
         </w:numPr>
-      </w:pPr>
-      <w:r>
+        <w:rPr>
+          <w:strike/>
+        </w:rPr>
+      </w:pPr>
+      <w:r>
+        <w:rPr>
+          <w:strike/>
+        </w:rPr>
         <w:t xml:space="preserve">Row 108. </w:t>
       </w:r>
       <w:r>
+        <w:rPr>
+          <w:strike/>
+        </w:rPr>
         <w:t>“</w:t>
       </w:r>
       <w:proofErr w:type="gramStart"/>
       <w:r>
+        <w:rPr>
+          <w:strike/>
+        </w:rPr>
         <w:t>….Bo</w:t>
       </w:r>
       <w:proofErr w:type="gramEnd"/>
       <w:r>
+        <w:rPr>
+          <w:strike/>
+        </w:rPr>
         <w:t xml:space="preserve"> at downhole conditions”</w:t>
       </w:r>
     </w:p>
@@ -4455,8 +5059,14 @@
           <w:ilvl w:val="0"/>
           <w:numId w:val="1"/>
         </w:numPr>
-      </w:pPr>
-      <w:r>
+        <w:rPr>
+          <w:strike/>
+        </w:rPr>
+      </w:pPr>
+      <w:r>
+        <w:rPr>
+          <w:strike/>
+        </w:rPr>
         <w:t>Add new Row for Frac gradient (in ppg)</w:t>
       </w:r>
     </w:p>
@@ -4467,26 +5077,50 @@
           <w:ilvl w:val="0"/>
           <w:numId w:val="1"/>
         </w:numPr>
-      </w:pPr>
-      <w:r>
+        <w:rPr>
+          <w:strike/>
+        </w:rPr>
+      </w:pPr>
+      <w:r>
+        <w:rPr>
+          <w:strike/>
+        </w:rPr>
         <w:t xml:space="preserve">Roe 134. Remove </w:t>
       </w:r>
       <w:r>
+        <w:rPr>
+          <w:strike/>
+        </w:rPr>
         <w:t>“(</w:t>
       </w:r>
       <w:r>
+        <w:rPr>
+          <w:strike/>
+        </w:rPr>
         <w:t>ESS</w:t>
       </w:r>
       <w:r>
+        <w:rPr>
+          <w:strike/>
+        </w:rPr>
         <w:t>)”, add “</w:t>
       </w:r>
       <w:r>
+        <w:rPr>
+          <w:strike/>
+        </w:rPr>
         <w:t>Other”</w:t>
       </w:r>
       <w:r>
+        <w:rPr>
+          <w:strike/>
+        </w:rPr>
         <w:t xml:space="preserve">, separate out Ceramic </w:t>
       </w:r>
       <w:r>
+        <w:rPr>
+          <w:strike/>
+        </w:rPr>
         <w:t>from “Other erosion resistant screen”.</w:t>
       </w:r>
     </w:p>
@@ -4497,11 +5131,20 @@
           <w:ilvl w:val="0"/>
           <w:numId w:val="1"/>
         </w:numPr>
-      </w:pPr>
-      <w:r>
+        <w:rPr>
+          <w:strike/>
+        </w:rPr>
+      </w:pPr>
+      <w:r>
+        <w:rPr>
+          <w:strike/>
+        </w:rPr>
         <w:t xml:space="preserve">Row 140. Add </w:t>
       </w:r>
       <w:r>
+        <w:rPr>
+          <w:strike/>
+        </w:rPr>
         <w:t>“No” as an option</w:t>
       </w:r>
     </w:p>
@@ -4532,11 +5175,20 @@
           <w:ilvl w:val="0"/>
           <w:numId w:val="1"/>
         </w:numPr>
-      </w:pPr>
-      <w:r>
+        <w:rPr>
+          <w:strike/>
+        </w:rPr>
+      </w:pPr>
+      <w:r>
+        <w:rPr>
+          <w:strike/>
+        </w:rPr>
         <w:t>Row 153. Give different options for pack efficiency</w:t>
       </w:r>
       <w:r>
+        <w:rPr>
+          <w:strike/>
+        </w:rPr>
         <w:t>.</w:t>
       </w:r>
     </w:p>
@@ -4547,8 +5199,14 @@
           <w:ilvl w:val="0"/>
           <w:numId w:val="1"/>
         </w:numPr>
-      </w:pPr>
-      <w:r>
+        <w:rPr>
+          <w:strike/>
+        </w:rPr>
+      </w:pPr>
+      <w:r>
+        <w:rPr>
+          <w:strike/>
+        </w:rPr>
         <w:t>Delete Rows 156 to 179 (eliminate chemical consolidation)</w:t>
       </w:r>
     </w:p>
@@ -4563,7 +5221,7 @@
 </file>
 
 <file path=word/numbering.xml><?xml version="1.0" encoding="utf-8"?>
-<w:numbering xmlns:wpc="http://schemas.microsoft.com/office/word/2010/wordprocessingCanvas" xmlns:cx="http://schemas.microsoft.com/office/drawing/2014/chartex" xmlns:cx1="http://schemas.microsoft.com/office/drawing/2015/9/8/chartex" xmlns:cx2="http://schemas.microsoft.com/office/drawing/2015/10/21/chartex" xmlns:cx3="http://schemas.microsoft.com/office/drawing/2016/5/9/chartex" xmlns:cx4="http://schemas.microsoft.com/office/drawing/2016/5/10/chartex" xmlns:cx5="http://schemas.microsoft.com/office/drawing/2016/5/11/chartex" xmlns:cx6="http://schemas.microsoft.com/office/drawing/2016/5/12/chartex" xmlns:cx7="http://schemas.microsoft.com/office/drawing/2016/5/13/chartex" xmlns:cx8="http://schemas.microsoft.com/office/drawing/2016/5/14/chartex" xmlns:mc="http://schemas.openxmlformats.org/markup-compatibility/2006" xmlns:aink="http://schemas.microsoft.com/office/drawing/2016/ink" xmlns:am3d="http://schemas.microsoft.com/office/drawing/2017/model3d" xmlns:o="urn:schemas-microsoft-com:office:office" xmlns:oel="http://schemas.microsoft.com/office/2019/extlst" xmlns:r="http://schemas.openxmlformats.org/officeDocument/2006/relationships" xmlns:m="http://schemas.openxmlformats.org/officeDocument/2006/math" xmlns:v="urn:schemas-microsoft-com:vml" xmlns:wp14="http://schemas.microsoft.com/office/word/2010/wordprocessingDrawing" xmlns:wp="http://schemas.openxmlformats.org/drawingml/2006/wordprocessingDrawing" xmlns:w10="urn:schemas-microsoft-com:office:word" xmlns:w="http://schemas.openxmlformats.org/wordprocessingml/2006/main" xmlns:w14="http://schemas.microsoft.com/office/word/2010/wordml" xmlns:w15="http://schemas.microsoft.com/office/word/2012/wordml" xmlns:w16cex="http://schemas.microsoft.com/office/word/2018/wordml/cex" xmlns:w16cid="http://schemas.microsoft.com/office/word/2016/wordml/cid" xmlns:w16="http://schemas.microsoft.com/office/word/2018/wordml" xmlns:w16du="http://schemas.microsoft.com/office/word/2023/wordml/word16du" xmlns:w16sdtdh="http://schemas.microsoft.com/office/word/2020/wordml/sdtdatahash" xmlns:w16sdtfl="http://schemas.microsoft.com/office/word/2024/wordml/sdtformatlock" xmlns:w16se="http://schemas.microsoft.com/office/word/2015/wordml/symex" xmlns:wpg="http://schemas.microsoft.com/office/word/2010/wordprocessingGroup" xmlns:wpi="http://schemas.microsoft.com/office/word/2010/wordprocessingInk" xmlns:wne="http://schemas.microsoft.com/office/word/2006/wordml" xmlns:wps="http://schemas.microsoft.com/office/word/2010/wordprocessingShape" mc:Ignorable="w14 w15 w16se w16cid w16 w16cex w16sdtdh w16sdtfl w16du wp14">
+<w:numbering xmlns:wpc="http://schemas.microsoft.com/office/word/2010/wordprocessingCanvas" xmlns:cx="http://schemas.microsoft.com/office/drawing/2014/chartex" xmlns:cx1="http://schemas.microsoft.com/office/drawing/2015/9/8/chartex" xmlns:cx2="http://schemas.microsoft.com/office/drawing/2015/10/21/chartex" xmlns:cx3="http://schemas.microsoft.com/office/drawing/2016/5/9/chartex" xmlns:cx4="http://schemas.microsoft.com/office/drawing/2016/5/10/chartex" xmlns:cx5="http://schemas.microsoft.com/office/drawing/2016/5/11/chartex" xmlns:cx6="http://schemas.microsoft.com/office/drawing/2016/5/12/chartex" xmlns:cx7="http://schemas.microsoft.com/office/drawing/2016/5/13/chartex" xmlns:cx8="http://schemas.microsoft.com/office/drawing/2016/5/14/chartex" xmlns:mc="http://schemas.openxmlformats.org/markup-compatibility/2006" xmlns:aink="http://schemas.microsoft.com/office/drawing/2016/ink" xmlns:am3d="http://schemas.microsoft.com/office/drawing/2017/model3d" xmlns:o="urn:schemas-microsoft-com:office:office" xmlns:oel="http://schemas.microsoft.com/office/2019/extlst" xmlns:r="http://schemas.openxmlformats.org/officeDocument/2006/relationships" xmlns:m="http://schemas.openxmlformats.org/officeDocument/2006/math" xmlns:v="urn:schemas-microsoft-com:vml" xmlns:wp14="http://schemas.microsoft.com/office/word/2010/wordprocessingDrawing" xmlns:wp="http://schemas.openxmlformats.org/drawingml/2006/wordprocessingDrawing" xmlns:w10="urn:schemas-microsoft-com:office:word" xmlns:w="http://schemas.openxmlformats.org/wordprocessingml/2006/main" xmlns:w14="http://schemas.microsoft.com/office/word/2010/wordml" xmlns:w15="http://schemas.microsoft.com/office/word/2012/wordml" xmlns:w16cei="http://schemas.microsoft.com/office/word/2026/wordml/cei" xmlns:w16cex="http://schemas.microsoft.com/office/word/2018/wordml/cex" xmlns:w16cid="http://schemas.microsoft.com/office/word/2016/wordml/cid" xmlns:w16="http://schemas.microsoft.com/office/word/2018/wordml" xmlns:w16du="http://schemas.microsoft.com/office/word/2023/wordml/word16du" xmlns:w16sdtdh="http://schemas.microsoft.com/office/word/2020/wordml/sdtdatahash" xmlns:w16sdtfl="http://schemas.microsoft.com/office/word/2024/wordml/sdtformatlock" xmlns:w16se="http://schemas.microsoft.com/office/word/2015/wordml/symex" xmlns:wpg="http://schemas.microsoft.com/office/word/2010/wordprocessingGroup" xmlns:wpi="http://schemas.microsoft.com/office/word/2010/wordprocessingInk" xmlns:wne="http://schemas.microsoft.com/office/word/2006/wordml" xmlns:wps="http://schemas.microsoft.com/office/word/2010/wordprocessingShape" mc:Ignorable="w14 w15 w16se w16cid w16 w16cex w16sdtdh w16sdtfl w16du wp14">
   <w:abstractNum w:abstractNumId="0" w15:restartNumberingAfterBreak="0">
     <w:nsid w:val="3E883932"/>
     <w:multiLevelType w:val="hybridMultilevel"/>

</xml_diff>